<commit_message>
Checkpoint 4.1 v2: CrewAI revisit wording (Word edit, synced to Markdown)
Co-Authored-By: Claude Opus 5.5 <noreply@anthropic.com>
</commit_message>
<xml_diff>
--- a/docs/Capstone Checkpoint 4.1 - Tree-of-Thought Reasoning v2.docx
+++ b/docs/Capstone Checkpoint 4.1 - Tree-of-Thought Reasoning v2.docx
@@ -10,13 +10,12 @@
       <w:r>
         <w:rPr>
           <w:rFonts w:ascii="Open Sans" w:hAnsi="Open Sans" w:cs="Open Sans"/>
-          <w:b/>
           <w:bCs/>
           <w:color w:val="A6192E"/>
           <w:sz w:val="34"/>
           <w:szCs w:val="34"/>
         </w:rPr>
-        <w:t xml:space="preserve">Capstone Checkpoint 4.1: Tree-of-Thought Reasoning</w:t>
+        <w:t>Capstone Checkpoint 4.1: Tree-of-Thought Reasoning</w:t>
       </w:r>
     </w:p>
     <w:p>
@@ -27,13 +26,12 @@
       <w:r>
         <w:rPr>
           <w:rFonts w:ascii="Open Sans" w:hAnsi="Open Sans" w:cs="Open Sans"/>
-          <w:b/>
           <w:bCs/>
           <w:color w:val="A6192E"/>
           <w:sz w:val="26"/>
           <w:szCs w:val="26"/>
         </w:rPr>
-        <w:t xml:space="preserve">Thesis Check: Choosing the Right Claims Before Testing Them</w:t>
+        <w:t>Thesis Check: Choosing the Right Claims Before Testing Them</w:t>
       </w:r>
     </w:p>
     <w:p>
@@ -49,7 +47,7 @@
           <w:sz w:val="21"/>
           <w:szCs w:val="21"/>
         </w:rPr>
-        <w:t xml:space="preserve">Mohit Sachdeva  |  Agentic AI Program  |  October 2026</w:t>
+        <w:t>Mohit Sachdeva  |  Agentic AI Program  |  October 2026</w:t>
       </w:r>
     </w:p>
     <w:p>
@@ -63,13 +61,12 @@
       <w:r>
         <w:rPr>
           <w:rFonts w:ascii="Open Sans" w:hAnsi="Open Sans" w:cs="Open Sans"/>
-          <w:b/>
           <w:bCs/>
           <w:color w:val="A6192E"/>
           <w:sz w:val="25"/>
           <w:szCs w:val="25"/>
         </w:rPr>
-        <w:t xml:space="preserve">1. Is ToT appropriate?</w:t>
+        <w:t>1. Is ToT appropriate?</w:t>
       </w:r>
     </w:p>
     <w:p>
@@ -84,7 +81,7 @@
           <w:sz w:val="21"/>
           <w:szCs w:val="21"/>
         </w:rPr>
-        <w:t xml:space="preserve">Yes, in one step only: when the Thesis Analyst turns the investor’s thesis into testable claims. Everywhere else, ToT would add cost without improving accuracy.</w:t>
+        <w:t>Yes, in one step only: when the Thesis Analyst turns the investor’s thesis into testable claims. Everywhere else, ToT would add cost without improving accuracy.</w:t>
       </w:r>
     </w:p>
     <w:p>
@@ -98,13 +95,12 @@
       <w:r>
         <w:rPr>
           <w:rFonts w:ascii="Open Sans" w:hAnsi="Open Sans" w:cs="Open Sans"/>
-          <w:b/>
           <w:bCs/>
           <w:color w:val="000000"/>
           <w:sz w:val="21"/>
           <w:szCs w:val="21"/>
         </w:rPr>
-        <w:t xml:space="preserve">Rule:</w:t>
+        <w:t>Rule:</w:t>
       </w:r>
       <w:r>
         <w:rPr>
@@ -133,7 +129,7 @@
           <w:sz w:val="21"/>
           <w:szCs w:val="21"/>
         </w:rPr>
-        <w:t xml:space="preserve">Claim decomposition is the only step that meets all three.</w:t>
+        <w:t>Claim decomposition is the only step that meets all three.</w:t>
       </w:r>
     </w:p>
     <w:tbl>
@@ -178,13 +174,12 @@
             <w:r>
               <w:rPr>
                 <w:rFonts w:ascii="Open Sans" w:hAnsi="Open Sans" w:cs="Open Sans"/>
-                <w:b/>
                 <w:bCs/>
                 <w:color w:val="FFFFFF"/>
                 <w:sz w:val="18"/>
                 <w:szCs w:val="18"/>
               </w:rPr>
-              <w:t xml:space="preserve">Step</w:t>
+              <w:t>Step</w:t>
             </w:r>
           </w:p>
         </w:tc>
@@ -200,13 +195,12 @@
             <w:r>
               <w:rPr>
                 <w:rFonts w:ascii="Open Sans" w:hAnsi="Open Sans" w:cs="Open Sans"/>
-                <w:b/>
                 <w:bCs/>
                 <w:color w:val="FFFFFF"/>
                 <w:sz w:val="18"/>
                 <w:szCs w:val="18"/>
               </w:rPr>
-              <w:t xml:space="preserve">ToT?</w:t>
+              <w:t>ToT?</w:t>
             </w:r>
           </w:p>
         </w:tc>
@@ -222,13 +216,12 @@
             <w:r>
               <w:rPr>
                 <w:rFonts w:ascii="Open Sans" w:hAnsi="Open Sans" w:cs="Open Sans"/>
-                <w:b/>
                 <w:bCs/>
                 <w:color w:val="FFFFFF"/>
                 <w:sz w:val="18"/>
                 <w:szCs w:val="18"/>
               </w:rPr>
-              <w:t xml:space="preserve">Why</w:t>
+              <w:t>Why</w:t>
             </w:r>
           </w:p>
         </w:tc>
@@ -253,7 +246,7 @@
                 <w:sz w:val="18"/>
                 <w:szCs w:val="18"/>
               </w:rPr>
-              <w:t xml:space="preserve">Thesis Analyst: claim decomposition</w:t>
+              <w:t>Thesis Analyst: claim decomposition</w:t>
             </w:r>
           </w:p>
         </w:tc>
@@ -268,13 +261,12 @@
             <w:r>
               <w:rPr>
                 <w:rFonts w:ascii="Open Sans" w:hAnsi="Open Sans" w:cs="Open Sans"/>
-                <w:b/>
                 <w:bCs/>
                 <w:color w:val="000000"/>
                 <w:sz w:val="18"/>
                 <w:szCs w:val="18"/>
               </w:rPr>
-              <w:t xml:space="preserve">Yes</w:t>
+              <w:t>Yes</w:t>
             </w:r>
           </w:p>
         </w:tc>
@@ -294,7 +286,7 @@
                 <w:sz w:val="18"/>
                 <w:szCs w:val="18"/>
               </w:rPr>
-              <w:t xml:space="preserve">Every later step inherits the claims; nothing sends them back</w:t>
+              <w:t>Every later step inherits the claims; nothing sends them back</w:t>
             </w:r>
           </w:p>
         </w:tc>
@@ -320,7 +312,7 @@
                 <w:sz w:val="18"/>
                 <w:szCs w:val="18"/>
               </w:rPr>
-              <w:t xml:space="preserve">Filing Researcher, Financial Data Analyst</w:t>
+              <w:t>Filing Researcher, Financial Data Analyst</w:t>
             </w:r>
           </w:p>
         </w:tc>
@@ -341,7 +333,7 @@
                 <w:sz w:val="18"/>
                 <w:szCs w:val="18"/>
               </w:rPr>
-              <w:t xml:space="preserve">No</w:t>
+              <w:t>No</w:t>
             </w:r>
           </w:p>
         </w:tc>
@@ -362,7 +354,7 @@
                 <w:sz w:val="18"/>
                 <w:szCs w:val="18"/>
               </w:rPr>
-              <w:t xml:space="preserve">ReAct already adapts to each search result; a miss ends as “insufficient evidence”</w:t>
+              <w:t>ReAct already adapts to each search result; a miss ends as “insufficient evidence”</w:t>
             </w:r>
           </w:p>
         </w:tc>
@@ -387,7 +379,7 @@
                 <w:sz w:val="18"/>
                 <w:szCs w:val="18"/>
               </w:rPr>
-              <w:t xml:space="preserve">Bull and Bear Advocates</w:t>
+              <w:t>Bull and Bear Advocates</w:t>
             </w:r>
           </w:p>
         </w:tc>
@@ -407,7 +399,7 @@
                 <w:sz w:val="18"/>
                 <w:szCs w:val="18"/>
               </w:rPr>
-              <w:t xml:space="preserve">No</w:t>
+              <w:t>No</w:t>
             </w:r>
           </w:p>
         </w:tc>
@@ -427,7 +419,7 @@
                 <w:sz w:val="18"/>
                 <w:szCs w:val="18"/>
               </w:rPr>
-              <w:t xml:space="preserve">Searching for the most persuasive argument rewards rhetoric, not truth</w:t>
+              <w:t>Searching for the most persuasive argument rewards rhetoric, not truth</w:t>
             </w:r>
           </w:p>
         </w:tc>
@@ -453,7 +445,7 @@
                 <w:sz w:val="18"/>
                 <w:szCs w:val="18"/>
               </w:rPr>
-              <w:t xml:space="preserve">Fact-Checker</w:t>
+              <w:t>Fact-Checker</w:t>
             </w:r>
           </w:p>
         </w:tc>
@@ -474,7 +466,7 @@
                 <w:sz w:val="18"/>
                 <w:szCs w:val="18"/>
               </w:rPr>
-              <w:t xml:space="preserve">No</w:t>
+              <w:t>No</w:t>
             </w:r>
           </w:p>
         </w:tc>
@@ -495,7 +487,7 @@
                 <w:sz w:val="18"/>
                 <w:szCs w:val="18"/>
               </w:rPr>
-              <w:t xml:space="preserve">A number matches its source or it doesn’t</w:t>
+              <w:t>A number matches its source or it doesn’t</w:t>
             </w:r>
           </w:p>
         </w:tc>
@@ -520,7 +512,7 @@
                 <w:sz w:val="18"/>
                 <w:szCs w:val="18"/>
               </w:rPr>
-              <w:t xml:space="preserve">Supervisor and verdict rubric</w:t>
+              <w:t>Supervisor and verdict rubric</w:t>
             </w:r>
           </w:p>
         </w:tc>
@@ -540,7 +532,7 @@
                 <w:sz w:val="18"/>
                 <w:szCs w:val="18"/>
               </w:rPr>
-              <w:t xml:space="preserve">No</w:t>
+              <w:t>No</w:t>
             </w:r>
           </w:p>
         </w:tc>
@@ -560,7 +552,7 @@
                 <w:sz w:val="18"/>
                 <w:szCs w:val="18"/>
               </w:rPr>
-              <w:t xml:space="preserve">The same filing must give the same verdict, at a bounded cost</w:t>
+              <w:t>The same filing must give the same verdict, at a bounded cost</w:t>
             </w:r>
           </w:p>
         </w:tc>
@@ -582,13 +574,12 @@
       <w:r>
         <w:rPr>
           <w:rFonts w:ascii="Open Sans" w:hAnsi="Open Sans" w:cs="Open Sans"/>
-          <w:b/>
           <w:bCs/>
           <w:color w:val="A6192E"/>
           <w:sz w:val="25"/>
           <w:szCs w:val="25"/>
         </w:rPr>
-        <w:t xml:space="preserve">2. Where ToT is used, and why a linear chain fails</w:t>
+        <w:t>2. Where ToT is used, and why a linear chain fails</w:t>
       </w:r>
     </w:p>
     <w:p>
@@ -607,7 +598,7 @@
           <w:sz w:val="21"/>
           <w:szCs w:val="21"/>
         </w:rPr>
-        <w:t xml:space="preserve">ToT runs inside the Thesis Analyst, after the investor enters a thesis and before they confirm the claims (Figure 1).</w:t>
+        <w:t>ToT runs inside the Thesis Analyst, after the investor enters a thesis and before they confirm the claims (Figure 1).</w:t>
       </w:r>
     </w:p>
     <w:p>
@@ -626,7 +617,7 @@
           <w:sz w:val="21"/>
           <w:szCs w:val="21"/>
         </w:rPr>
-        <w:t xml:space="preserve">It picks the best set of 3–5 testable claims.</w:t>
+        <w:t>It picks the best set of 3–5 testable claims.</w:t>
       </w:r>
     </w:p>
     <w:p>
@@ -645,7 +636,7 @@
           <w:sz w:val="21"/>
           <w:szCs w:val="21"/>
         </w:rPr>
-        <w:t xml:space="preserve">It runs once per thesis. Quarterly re-checks reuse the confirmed claims.</w:t>
+        <w:t>It runs once per thesis. Quarterly re-checks reuse the confirmed claims.</w:t>
       </w:r>
     </w:p>
     <w:p>
@@ -658,6 +649,7 @@
         <w:rPr>
           <w:noProof/>
         </w:rPr>
+        <w:lastRenderedPageBreak/>
         <w:drawing>
           <wp:inline distT="0" distB="0" distL="0" distR="0">
             <wp:extent cx="6126480" cy="5483200"/>
@@ -674,7 +666,7 @@
                     <pic:cNvPicPr/>
                   </pic:nvPicPr>
                   <pic:blipFill>
-                    <a:blip r:embed="rId200"/>
+                    <a:blip r:embed="rId12"/>
                     <a:stretch>
                       <a:fillRect/>
                     </a:stretch>
@@ -710,7 +702,7 @@
           <w:sz w:val="17"/>
           <w:szCs w:val="17"/>
         </w:rPr>
-        <w:t xml:space="preserve">Figure 1. Thesis Check system design, with ToT claim search inside the Thesis Analyst.</w:t>
+        <w:t>Figure 1. Thesis Check system design, with ToT claim search inside the Thesis Analyst.</w:t>
       </w:r>
     </w:p>
     <w:p>
@@ -725,7 +717,7 @@
           <w:sz w:val="21"/>
           <w:szCs w:val="21"/>
         </w:rPr>
-        <w:t xml:space="preserve">Take Priya’s thesis: “AI demand will keep gross margins above 60%.” A linear chain of thought fails in three ways:</w:t>
+        <w:t>Take Priya’s thesis: “AI demand will keep gross margins above 60%.” A linear chain of thought fails in three ways:</w:t>
       </w:r>
     </w:p>
     <w:p>
@@ -739,13 +731,12 @@
       <w:r>
         <w:rPr>
           <w:rFonts w:ascii="Open Sans" w:hAnsi="Open Sans" w:cs="Open Sans"/>
-          <w:b/>
           <w:bCs/>
           <w:color w:val="000000"/>
           <w:sz w:val="21"/>
           <w:szCs w:val="21"/>
         </w:rPr>
-        <w:t xml:space="preserve">Premature commitment.</w:t>
+        <w:t>Premature commitment.</w:t>
       </w:r>
       <w:r>
         <w:rPr>
@@ -769,13 +760,12 @@
       <w:r>
         <w:rPr>
           <w:rFonts w:ascii="Open Sans" w:hAnsi="Open Sans" w:cs="Open Sans"/>
-          <w:b/>
           <w:bCs/>
           <w:color w:val="000000"/>
           <w:sz w:val="21"/>
           <w:szCs w:val="21"/>
         </w:rPr>
-        <w:t xml:space="preserve">High branching.</w:t>
+        <w:t>High branching.</w:t>
       </w:r>
       <w:r>
         <w:rPr>
@@ -799,13 +789,12 @@
       <w:r>
         <w:rPr>
           <w:rFonts w:ascii="Open Sans" w:hAnsi="Open Sans" w:cs="Open Sans"/>
-          <w:b/>
           <w:bCs/>
           <w:color w:val="000000"/>
           <w:sz w:val="21"/>
           <w:szCs w:val="21"/>
         </w:rPr>
-        <w:t xml:space="preserve">Constraint complexity.</w:t>
+        <w:t>Constraint complexity.</w:t>
       </w:r>
       <w:r>
         <w:rPr>
@@ -834,7 +823,7 @@
           <w:sz w:val="21"/>
           <w:szCs w:val="21"/>
         </w:rPr>
-        <w:t xml:space="preserve">3–5 claims</w:t>
+        <w:t>3–5 claims</w:t>
       </w:r>
     </w:p>
     <w:p>
@@ -865,7 +854,7 @@
           <w:sz w:val="21"/>
           <w:szCs w:val="21"/>
         </w:rPr>
-        <w:t xml:space="preserve">this company’s</w:t>
+        <w:t>this company’s</w:t>
       </w:r>
       <w:r>
         <w:rPr>
@@ -894,7 +883,8 @@
           <w:sz w:val="21"/>
           <w:szCs w:val="21"/>
         </w:rPr>
-        <w:t xml:space="preserve">no price-based claims</w:t>
+        <w:lastRenderedPageBreak/>
+        <w:t>no price-based claims</w:t>
       </w:r>
     </w:p>
     <w:p>
@@ -913,7 +903,7 @@
           <w:sz w:val="21"/>
           <w:szCs w:val="21"/>
         </w:rPr>
-        <w:t xml:space="preserve">the investor’s numbers unchanged</w:t>
+        <w:t>the investor’s numbers unchanged</w:t>
       </w:r>
     </w:p>
     <w:p>
@@ -932,7 +922,7 @@
           <w:sz w:val="21"/>
           <w:szCs w:val="21"/>
         </w:rPr>
-        <w:t xml:space="preserve">no duplicate measures</w:t>
+        <w:t>no duplicate measures</w:t>
       </w:r>
     </w:p>
     <w:p>
@@ -951,7 +941,7 @@
           <w:sz w:val="21"/>
           <w:szCs w:val="21"/>
         </w:rPr>
-        <w:t xml:space="preserve">at least one claim that could fail</w:t>
+        <w:t>at least one claim that could fail</w:t>
       </w:r>
     </w:p>
     <w:p>
@@ -965,13 +955,12 @@
       <w:r>
         <w:rPr>
           <w:rFonts w:ascii="Open Sans" w:hAnsi="Open Sans" w:cs="Open Sans"/>
-          <w:b/>
           <w:bCs/>
           <w:color w:val="A6192E"/>
           <w:sz w:val="25"/>
           <w:szCs w:val="25"/>
         </w:rPr>
-        <w:t xml:space="preserve">3. ToT structure</w:t>
+        <w:t>3. ToT structure</w:t>
       </w:r>
     </w:p>
     <w:tbl>
@@ -1015,13 +1004,12 @@
             <w:r>
               <w:rPr>
                 <w:rFonts w:ascii="Open Sans" w:hAnsi="Open Sans" w:cs="Open Sans"/>
-                <w:b/>
                 <w:bCs/>
                 <w:color w:val="FFFFFF"/>
                 <w:sz w:val="18"/>
                 <w:szCs w:val="18"/>
               </w:rPr>
-              <w:t xml:space="preserve">Element</w:t>
+              <w:t>Element</w:t>
             </w:r>
           </w:p>
         </w:tc>
@@ -1037,13 +1025,12 @@
             <w:r>
               <w:rPr>
                 <w:rFonts w:ascii="Open Sans" w:hAnsi="Open Sans" w:cs="Open Sans"/>
-                <w:b/>
                 <w:bCs/>
                 <w:color w:val="FFFFFF"/>
                 <w:sz w:val="18"/>
                 <w:szCs w:val="18"/>
               </w:rPr>
-              <w:t xml:space="preserve">Definition</w:t>
+              <w:t>Definition</w:t>
             </w:r>
           </w:p>
         </w:tc>
@@ -1068,7 +1055,7 @@
                 <w:sz w:val="18"/>
                 <w:szCs w:val="18"/>
               </w:rPr>
-              <w:t xml:space="preserve">Thought</w:t>
+              <w:t>Thought</w:t>
             </w:r>
           </w:p>
         </w:tc>
@@ -1088,7 +1075,7 @@
                 <w:sz w:val="18"/>
                 <w:szCs w:val="18"/>
               </w:rPr>
-              <w:t xml:space="preserve">One decision about making the thesis testable: how to read it, or how to measure it</w:t>
+              <w:t>One decision about making the thesis testable: how to read it, or how to measure it</w:t>
             </w:r>
           </w:p>
         </w:tc>
@@ -1114,7 +1101,7 @@
                 <w:sz w:val="18"/>
                 <w:szCs w:val="18"/>
               </w:rPr>
-              <w:t xml:space="preserve">Node (reasoning state)</w:t>
+              <w:t>Node (reasoning state)</w:t>
             </w:r>
           </w:p>
         </w:tc>
@@ -1135,7 +1122,7 @@
                 <w:sz w:val="18"/>
                 <w:szCs w:val="18"/>
               </w:rPr>
-              <w:t xml:space="preserve">The root plus the thoughts on its path, stored as an immutable record</w:t>
+              <w:t>The root plus the thoughts on its path, stored as an immutable record</w:t>
             </w:r>
           </w:p>
         </w:tc>
@@ -1160,7 +1147,7 @@
                 <w:sz w:val="18"/>
                 <w:szCs w:val="18"/>
               </w:rPr>
-              <w:t xml:space="preserve">Root</w:t>
+              <w:t>Root</w:t>
             </w:r>
           </w:p>
         </w:tc>
@@ -1180,7 +1167,7 @@
                 <w:sz w:val="18"/>
                 <w:szCs w:val="18"/>
               </w:rPr>
-              <w:t xml:space="preserve">Thesis, ticker, clarifying answers, and the thresholds the investor stated</w:t>
+              <w:t>Thesis, ticker, clarifying answers, and the thresholds the investor stated</w:t>
             </w:r>
           </w:p>
         </w:tc>
@@ -1206,7 +1193,7 @@
                 <w:sz w:val="18"/>
                 <w:szCs w:val="18"/>
               </w:rPr>
-              <w:t xml:space="preserve">Depth 1</w:t>
+              <w:t>Depth 1</w:t>
             </w:r>
           </w:p>
         </w:tc>
@@ -1232,23 +1219,22 @@
             <w:r>
               <w:rPr>
                 <w:rFonts w:ascii="Open Sans" w:hAnsi="Open Sans" w:cs="Open Sans"/>
-                <w:b/>
                 <w:bCs/>
                 <w:color w:val="000000"/>
                 <w:sz w:val="18"/>
                 <w:szCs w:val="18"/>
               </w:rPr>
-              <w:t xml:space="preserve">reading</w:t>
-            </w:r>
-            <w:r>
-              <w:rPr>
-                <w:rFonts w:ascii="Open Sans" w:hAnsi="Open Sans" w:cs="Open Sans"/>
-                <w:b w:val="0"/>
-                <w:color w:val="000000"/>
-                <w:sz w:val="18"/>
-                <w:szCs w:val="18"/>
-              </w:rPr>
-              <w:t xml:space="preserve">: the thesis as a cause-and-effect chain, e.g., AI demand → data-center sales → richer mix → gross margin ≥ 60%</w:t>
+              <w:t>reading</w:t>
+            </w:r>
+            <w:r>
+              <w:rPr>
+                <w:rFonts w:ascii="Open Sans" w:hAnsi="Open Sans" w:cs="Open Sans"/>
+                <w:b w:val="0"/>
+                <w:color w:val="000000"/>
+                <w:sz w:val="18"/>
+                <w:szCs w:val="18"/>
+              </w:rPr>
+              <w:t>: the thesis as a cause-and-effect chain, e.g., AI demand → data-center sales → richer mix → gross margin ≥ 60%</w:t>
             </w:r>
           </w:p>
         </w:tc>
@@ -1273,7 +1259,7 @@
                 <w:sz w:val="18"/>
                 <w:szCs w:val="18"/>
               </w:rPr>
-              <w:t xml:space="preserve">Depth 2 (leaf)</w:t>
+              <w:t>Depth 2 (leaf)</w:t>
             </w:r>
           </w:p>
         </w:tc>
@@ -1298,23 +1284,22 @@
             <w:r>
               <w:rPr>
                 <w:rFonts w:ascii="Open Sans" w:hAnsi="Open Sans" w:cs="Open Sans"/>
-                <w:b/>
                 <w:bCs/>
                 <w:color w:val="000000"/>
                 <w:sz w:val="18"/>
                 <w:szCs w:val="18"/>
               </w:rPr>
-              <w:t xml:space="preserve">claim set</w:t>
-            </w:r>
-            <w:r>
-              <w:rPr>
-                <w:rFonts w:ascii="Open Sans" w:hAnsi="Open Sans" w:cs="Open Sans"/>
-                <w:b w:val="0"/>
-                <w:color w:val="000000"/>
-                <w:sz w:val="18"/>
-                <w:szCs w:val="18"/>
-              </w:rPr>
-              <w:t xml:space="preserve">: 3–5 claims, each with a metric, threshold, period and source</w:t>
+              <w:t>claim set</w:t>
+            </w:r>
+            <w:r>
+              <w:rPr>
+                <w:rFonts w:ascii="Open Sans" w:hAnsi="Open Sans" w:cs="Open Sans"/>
+                <w:b w:val="0"/>
+                <w:color w:val="000000"/>
+                <w:sz w:val="18"/>
+                <w:szCs w:val="18"/>
+              </w:rPr>
+              <w:t>: 3–5 claims, each with a metric, threshold, period and source</w:t>
             </w:r>
           </w:p>
         </w:tc>
@@ -1340,7 +1325,7 @@
                 <w:sz w:val="18"/>
                 <w:szCs w:val="18"/>
               </w:rPr>
-              <w:t xml:space="preserve">Branch</w:t>
+              <w:t>Branch</w:t>
             </w:r>
           </w:p>
         </w:tc>
@@ -1361,7 +1346,7 @@
                 <w:sz w:val="18"/>
                 <w:szCs w:val="18"/>
               </w:rPr>
-              <w:t xml:space="preserve">An alternative reading, or an alternative claim set for the same reading</w:t>
+              <w:t>An alternative reading, or an alternative claim set for the same reading</w:t>
             </w:r>
           </w:p>
         </w:tc>
@@ -1386,7 +1371,7 @@
                 <w:sz w:val="18"/>
                 <w:szCs w:val="18"/>
               </w:rPr>
-              <w:t xml:space="preserve">Branching factor</w:t>
+              <w:t>Branching factor</w:t>
             </w:r>
           </w:p>
         </w:tc>
@@ -1406,7 +1391,7 @@
                 <w:sz w:val="18"/>
                 <w:szCs w:val="18"/>
               </w:rPr>
-              <w:t xml:space="preserve">3 children per node; the beam keeps 2 readings, so at most 9 nodes</w:t>
+              <w:t>3 children per node; the beam keeps 2 readings, so at most 9 nodes</w:t>
             </w:r>
           </w:p>
         </w:tc>
@@ -1432,7 +1417,7 @@
                 <w:sz w:val="18"/>
                 <w:szCs w:val="18"/>
               </w:rPr>
-              <w:t xml:space="preserve">Depth limit</w:t>
+              <w:t>Depth limit</w:t>
             </w:r>
           </w:p>
         </w:tc>
@@ -1453,7 +1438,7 @@
                 <w:sz w:val="18"/>
                 <w:szCs w:val="18"/>
               </w:rPr>
-              <w:t xml:space="preserve">2: a leaf is a complete claim set</w:t>
+              <w:t>2: a leaf is a complete claim set</w:t>
             </w:r>
           </w:p>
         </w:tc>
@@ -1471,13 +1456,12 @@
       <w:r>
         <w:rPr>
           <w:rFonts w:ascii="Open Sans" w:hAnsi="Open Sans" w:cs="Open Sans"/>
-          <w:b/>
           <w:bCs/>
           <w:color w:val="000000"/>
           <w:sz w:val="21"/>
           <w:szCs w:val="21"/>
         </w:rPr>
-        <w:t xml:space="preserve">Termination:</w:t>
+        <w:t>Termination:</w:t>
       </w:r>
     </w:p>
     <w:p>
@@ -1496,7 +1480,7 @@
           <w:sz w:val="21"/>
           <w:szCs w:val="21"/>
         </w:rPr>
-        <w:t xml:space="preserve">The search stops when the depth-2 claim sets are scored. The top-scoring set goes to the investor for confirmation.</w:t>
+        <w:t>The search stops when the depth-2 claim sets are scored. The top-scoring set goes to the investor for confirmation.</w:t>
       </w:r>
     </w:p>
     <w:p>
@@ -1515,7 +1499,7 @@
           <w:sz w:val="21"/>
           <w:szCs w:val="21"/>
         </w:rPr>
-        <w:t xml:space="preserve">It stops early if the budget runs out (it then shows the best set so far) or if no candidate survives (Section 5).</w:t>
+        <w:t>It stops early if the budget runs out (it then shows the best set so far) or if no candidate survives (Section 5).</w:t>
       </w:r>
     </w:p>
     <w:p>
@@ -1529,13 +1513,12 @@
       <w:r>
         <w:rPr>
           <w:rFonts w:ascii="Open Sans" w:hAnsi="Open Sans" w:cs="Open Sans"/>
-          <w:b/>
           <w:bCs/>
           <w:color w:val="A6192E"/>
           <w:sz w:val="25"/>
           <w:szCs w:val="25"/>
         </w:rPr>
-        <w:t xml:space="preserve">4. Search strategy: beam search, width 2</w:t>
+        <w:t>4. Search strategy: beam search, width 2</w:t>
       </w:r>
     </w:p>
     <w:p>
@@ -1554,7 +1537,7 @@
           <w:sz w:val="21"/>
           <w:szCs w:val="21"/>
         </w:rPr>
-        <w:t xml:space="preserve">Compares readings side by side and drops weak ones before spending calls on them.</w:t>
+        <w:t>Compares readings side by side and drops weak ones before spending calls on them.</w:t>
       </w:r>
     </w:p>
     <w:p>
@@ -1573,7 +1556,7 @@
           <w:sz w:val="21"/>
           <w:szCs w:val="21"/>
         </w:rPr>
-        <w:t xml:space="preserve">Has a fixed, predictable cost.</w:t>
+        <w:t>Has a fixed, predictable cost.</w:t>
       </w:r>
     </w:p>
     <w:p>
@@ -1592,7 +1575,7 @@
           <w:sz w:val="21"/>
           <w:szCs w:val="21"/>
         </w:rPr>
-        <w:t xml:space="preserve">Width 2 keeps a backup reading in case the critic misjudges the first.</w:t>
+        <w:t>Width 2 keeps a backup reading in case the critic misjudges the first.</w:t>
       </w:r>
     </w:p>
     <w:p>
@@ -1611,7 +1594,7 @@
           <w:sz w:val="21"/>
           <w:szCs w:val="21"/>
         </w:rPr>
-        <w:t xml:space="preserve">The generator proposes 3 distinct siblings in one call at temperature 0, so the same thesis gives nearly the same tree.</w:t>
+        <w:t>The generator proposes 3 distinct siblings in one call at temperature 0, so the same thesis gives nearly the same tree.</w:t>
       </w:r>
     </w:p>
     <w:tbl>
@@ -1658,13 +1641,12 @@
             <w:r>
               <w:rPr>
                 <w:rFonts w:ascii="Open Sans" w:hAnsi="Open Sans" w:cs="Open Sans"/>
-                <w:b/>
                 <w:bCs/>
                 <w:color w:val="FFFFFF"/>
                 <w:sz w:val="18"/>
                 <w:szCs w:val="18"/>
               </w:rPr>
-              <w:t xml:space="preserve">Strategy</w:t>
+              <w:t>Strategy</w:t>
             </w:r>
           </w:p>
         </w:tc>
@@ -1680,13 +1662,12 @@
             <w:r>
               <w:rPr>
                 <w:rFonts w:ascii="Open Sans" w:hAnsi="Open Sans" w:cs="Open Sans"/>
-                <w:b/>
                 <w:bCs/>
                 <w:color w:val="FFFFFF"/>
                 <w:sz w:val="18"/>
                 <w:szCs w:val="18"/>
               </w:rPr>
-              <w:t xml:space="preserve">Compute</w:t>
+              <w:t>Compute</w:t>
             </w:r>
           </w:p>
         </w:tc>
@@ -1702,13 +1683,12 @@
             <w:r>
               <w:rPr>
                 <w:rFonts w:ascii="Open Sans" w:hAnsi="Open Sans" w:cs="Open Sans"/>
-                <w:b/>
                 <w:bCs/>
                 <w:color w:val="FFFFFF"/>
                 <w:sz w:val="18"/>
                 <w:szCs w:val="18"/>
               </w:rPr>
-              <w:t xml:space="preserve">Latency</w:t>
+              <w:t>Latency</w:t>
             </w:r>
           </w:p>
         </w:tc>
@@ -1724,13 +1704,12 @@
             <w:r>
               <w:rPr>
                 <w:rFonts w:ascii="Open Sans" w:hAnsi="Open Sans" w:cs="Open Sans"/>
-                <w:b/>
                 <w:bCs/>
                 <w:color w:val="FFFFFF"/>
                 <w:sz w:val="18"/>
                 <w:szCs w:val="18"/>
               </w:rPr>
-              <w:t xml:space="preserve">Complexity</w:t>
+              <w:t>Complexity</w:t>
             </w:r>
           </w:p>
         </w:tc>
@@ -1746,13 +1725,12 @@
             <w:r>
               <w:rPr>
                 <w:rFonts w:ascii="Open Sans" w:hAnsi="Open Sans" w:cs="Open Sans"/>
-                <w:b/>
                 <w:bCs/>
                 <w:color w:val="FFFFFF"/>
                 <w:sz w:val="18"/>
                 <w:szCs w:val="18"/>
               </w:rPr>
-              <w:t xml:space="preserve">Verdict</w:t>
+              <w:t>Verdict</w:t>
             </w:r>
           </w:p>
         </w:tc>
@@ -1772,13 +1750,12 @@
             <w:r>
               <w:rPr>
                 <w:rFonts w:ascii="Open Sans" w:hAnsi="Open Sans" w:cs="Open Sans"/>
-                <w:b/>
                 <w:bCs/>
                 <w:color w:val="000000"/>
                 <w:sz w:val="18"/>
                 <w:szCs w:val="18"/>
               </w:rPr>
-              <w:t xml:space="preserve">Beam (chosen)</w:t>
+              <w:t>Beam (chosen)</w:t>
             </w:r>
           </w:p>
         </w:tc>
@@ -1798,7 +1775,7 @@
                 <w:sz w:val="18"/>
                 <w:szCs w:val="18"/>
               </w:rPr>
-              <w:t xml:space="preserve">Fixed: 9 nodes, 12 LLM calls</w:t>
+              <w:t>Fixed: 9 nodes, 12 LLM calls</w:t>
             </w:r>
           </w:p>
         </w:tc>
@@ -1818,7 +1795,7 @@
                 <w:sz w:val="18"/>
                 <w:szCs w:val="18"/>
               </w:rPr>
-              <w:t xml:space="preserve">4 rounds, parallel within a level</w:t>
+              <w:t>4 rounds, parallel within a level</w:t>
             </w:r>
           </w:p>
         </w:tc>
@@ -1838,7 +1815,7 @@
                 <w:sz w:val="18"/>
                 <w:szCs w:val="18"/>
               </w:rPr>
-              <w:t xml:space="preserve">Low: keep the top 2 per level</w:t>
+              <w:t>Low: keep the top 2 per level</w:t>
             </w:r>
           </w:p>
         </w:tc>
@@ -1858,7 +1835,7 @@
                 <w:sz w:val="18"/>
                 <w:szCs w:val="18"/>
               </w:rPr>
-              <w:t xml:space="preserve">Best balance</w:t>
+              <w:t>Best balance</w:t>
             </w:r>
           </w:p>
         </w:tc>
@@ -1884,7 +1861,7 @@
                 <w:sz w:val="18"/>
                 <w:szCs w:val="18"/>
               </w:rPr>
-              <w:t xml:space="preserve">BFS</w:t>
+              <w:t>BFS</w:t>
             </w:r>
           </w:p>
         </w:tc>
@@ -1905,7 +1882,7 @@
                 <w:sz w:val="18"/>
                 <w:szCs w:val="18"/>
               </w:rPr>
-              <w:t xml:space="preserve">16 calls, grows with every reading</w:t>
+              <w:t>16 calls, grows with every reading</w:t>
             </w:r>
           </w:p>
         </w:tc>
@@ -1926,7 +1903,7 @@
                 <w:sz w:val="18"/>
                 <w:szCs w:val="18"/>
               </w:rPr>
-              <w:t xml:space="preserve">4 rounds</w:t>
+              <w:t>4 rounds</w:t>
             </w:r>
           </w:p>
         </w:tc>
@@ -1947,7 +1924,7 @@
                 <w:sz w:val="18"/>
                 <w:szCs w:val="18"/>
               </w:rPr>
-              <w:t xml:space="preserve">Lowest</w:t>
+              <w:t>Lowest</w:t>
             </w:r>
           </w:p>
         </w:tc>
@@ -1968,7 +1945,7 @@
                 <w:sz w:val="18"/>
                 <w:szCs w:val="18"/>
               </w:rPr>
-              <w:t xml:space="preserve">Expands readings already known to be weak</w:t>
+              <w:t>Expands readings already known to be weak</w:t>
             </w:r>
           </w:p>
         </w:tc>
@@ -1993,7 +1970,8 @@
                 <w:sz w:val="18"/>
                 <w:szCs w:val="18"/>
               </w:rPr>
-              <w:t xml:space="preserve">DFS</w:t>
+              <w:lastRenderedPageBreak/>
+              <w:t>DFS</w:t>
             </w:r>
           </w:p>
         </w:tc>
@@ -2013,7 +1991,7 @@
                 <w:sz w:val="18"/>
                 <w:szCs w:val="18"/>
               </w:rPr>
-              <w:t xml:space="preserve">6 to 16 calls, unpredictable</w:t>
+              <w:t>6 to 16 calls, unpredictable</w:t>
             </w:r>
           </w:p>
         </w:tc>
@@ -2033,7 +2011,7 @@
                 <w:sz w:val="18"/>
                 <w:szCs w:val="18"/>
               </w:rPr>
-              <w:t xml:space="preserve">Up to 8 rounds</w:t>
+              <w:t>Up to 8 rounds</w:t>
             </w:r>
           </w:p>
         </w:tc>
@@ -2053,7 +2031,7 @@
                 <w:sz w:val="18"/>
                 <w:szCs w:val="18"/>
               </w:rPr>
-              <w:t xml:space="preserve">Medium: backtracking and a stop rule</w:t>
+              <w:t>Medium: backtracking and a stop rule</w:t>
             </w:r>
           </w:p>
         </w:tc>
@@ -2073,7 +2051,7 @@
                 <w:sz w:val="18"/>
                 <w:szCs w:val="18"/>
               </w:rPr>
-              <w:t xml:space="preserve">Commits to the first reading: the failure ToT fixes</w:t>
+              <w:t>Commits to the first reading: the failure ToT fixes</w:t>
             </w:r>
           </w:p>
         </w:tc>
@@ -2099,7 +2077,7 @@
                 <w:sz w:val="18"/>
                 <w:szCs w:val="18"/>
               </w:rPr>
-              <w:t xml:space="preserve">Monte Carlo</w:t>
+              <w:t>Monte Carlo</w:t>
             </w:r>
           </w:p>
         </w:tc>
@@ -2120,7 +2098,7 @@
                 <w:sz w:val="18"/>
                 <w:szCs w:val="18"/>
               </w:rPr>
-              <w:t xml:space="preserve">Dozens of rollouts</w:t>
+              <w:t>Dozens of rollouts</w:t>
             </w:r>
           </w:p>
         </w:tc>
@@ -2141,7 +2119,7 @@
                 <w:sz w:val="18"/>
                 <w:szCs w:val="18"/>
               </w:rPr>
-              <w:t xml:space="preserve">Many sequential rounds</w:t>
+              <w:t>Many sequential rounds</w:t>
             </w:r>
           </w:p>
         </w:tc>
@@ -2162,7 +2140,7 @@
                 <w:sz w:val="18"/>
                 <w:szCs w:val="18"/>
               </w:rPr>
-              <w:t xml:space="preserve">High: rollouts and value backup</w:t>
+              <w:t>High: rollouts and value backup</w:t>
             </w:r>
           </w:p>
         </w:tc>
@@ -2183,7 +2161,7 @@
                 <w:sz w:val="18"/>
                 <w:szCs w:val="18"/>
               </w:rPr>
-              <w:t xml:space="preserve">Built for deep trees; adds variance here</w:t>
+              <w:t>Built for deep trees; adds variance here</w:t>
             </w:r>
           </w:p>
         </w:tc>
@@ -2201,13 +2179,12 @@
       <w:r>
         <w:rPr>
           <w:rFonts w:ascii="Open Sans" w:hAnsi="Open Sans" w:cs="Open Sans"/>
-          <w:b/>
           <w:bCs/>
           <w:color w:val="000000"/>
           <w:sz w:val="21"/>
           <w:szCs w:val="21"/>
         </w:rPr>
-        <w:t xml:space="preserve">Budget:</w:t>
+        <w:t>Budget:</w:t>
       </w:r>
     </w:p>
     <w:p>
@@ -2226,7 +2203,7 @@
           <w:sz w:val="21"/>
           <w:szCs w:val="21"/>
         </w:rPr>
-        <w:t xml:space="preserve">At most 14 LLM calls, 20 tool probes and about 30k tokens.</w:t>
+        <w:t>At most 14 LLM calls, 20 tool probes and about 30k tokens.</w:t>
       </w:r>
     </w:p>
     <w:p>
@@ -2245,7 +2222,7 @@
           <w:sz w:val="21"/>
           <w:szCs w:val="21"/>
         </w:rPr>
-        <w:t xml:space="preserve">Target latency is under 20 seconds.</w:t>
+        <w:t>Target latency is under 20 seconds.</w:t>
       </w:r>
     </w:p>
     <w:p>
@@ -2264,7 +2241,7 @@
           <w:sz w:val="21"/>
           <w:szCs w:val="21"/>
         </w:rPr>
-        <w:t xml:space="preserve">ToT stays only if it beats a single linear decomposition on the golden test set.</w:t>
+        <w:t>ToT stays only if it beats a single linear decomposition on the golden test set.</w:t>
       </w:r>
     </w:p>
     <w:p>
@@ -2278,13 +2255,12 @@
       <w:r>
         <w:rPr>
           <w:rFonts w:ascii="Open Sans" w:hAnsi="Open Sans" w:cs="Open Sans"/>
-          <w:b/>
           <w:bCs/>
           <w:color w:val="A6192E"/>
           <w:sz w:val="25"/>
           <w:szCs w:val="25"/>
         </w:rPr>
-        <w:t xml:space="preserve">5. Evaluation and pruning</w:t>
+        <w:t>5. Evaluation and pruning</w:t>
       </w:r>
     </w:p>
     <w:p>
@@ -2294,13 +2270,12 @@
       <w:r>
         <w:rPr>
           <w:rFonts w:ascii="Open Sans" w:hAnsi="Open Sans" w:cs="Open Sans"/>
-          <w:b/>
           <w:bCs/>
           <w:color w:val="000000"/>
           <w:sz w:val="21"/>
           <w:szCs w:val="21"/>
         </w:rPr>
-        <w:t xml:space="preserve">Who evaluates.</w:t>
+        <w:t>Who evaluates.</w:t>
       </w:r>
       <w:r>
         <w:rPr>
@@ -2324,13 +2299,12 @@
       <w:r>
         <w:rPr>
           <w:rFonts w:ascii="Open Sans" w:hAnsi="Open Sans" w:cs="Open Sans"/>
-          <w:b/>
           <w:bCs/>
           <w:color w:val="000000"/>
           <w:sz w:val="21"/>
           <w:szCs w:val="21"/>
         </w:rPr>
-        <w:t xml:space="preserve">Gates</w:t>
+        <w:t>Gates</w:t>
       </w:r>
       <w:r>
         <w:rPr>
@@ -2340,7 +2314,7 @@
           <w:sz w:val="21"/>
           <w:szCs w:val="21"/>
         </w:rPr>
-        <w:t xml:space="preserve">: code and tool checks.</w:t>
+        <w:t>: code and tool checks.</w:t>
       </w:r>
     </w:p>
     <w:p>
@@ -2354,13 +2328,12 @@
       <w:r>
         <w:rPr>
           <w:rFonts w:ascii="Open Sans" w:hAnsi="Open Sans" w:cs="Open Sans"/>
-          <w:b/>
           <w:bCs/>
           <w:color w:val="000000"/>
           <w:sz w:val="21"/>
           <w:szCs w:val="21"/>
         </w:rPr>
-        <w:t xml:space="preserve">Claim Critic</w:t>
+        <w:t>Claim Critic</w:t>
       </w:r>
       <w:r>
         <w:rPr>
@@ -2370,7 +2343,7 @@
           <w:sz w:val="21"/>
           <w:szCs w:val="21"/>
         </w:rPr>
-        <w:t xml:space="preserve">: a separate LLM prompt at temperature 0.</w:t>
+        <w:t>: a separate LLM prompt at temperature 0.</w:t>
       </w:r>
     </w:p>
     <w:p>
@@ -2385,7 +2358,7 @@
           <w:sz w:val="21"/>
           <w:szCs w:val="21"/>
         </w:rPr>
-        <w:t xml:space="preserve">A deterministic decision maker then applies the thresholds below.</w:t>
+        <w:t>A deterministic decision maker then applies the thresholds below.</w:t>
       </w:r>
     </w:p>
     <w:tbl>
@@ -2430,13 +2403,12 @@
             <w:r>
               <w:rPr>
                 <w:rFonts w:ascii="Open Sans" w:hAnsi="Open Sans" w:cs="Open Sans"/>
-                <w:b/>
                 <w:bCs/>
                 <w:color w:val="FFFFFF"/>
                 <w:sz w:val="18"/>
                 <w:szCs w:val="18"/>
               </w:rPr>
-              <w:t xml:space="preserve">Gate</w:t>
+              <w:t>Gate</w:t>
             </w:r>
           </w:p>
         </w:tc>
@@ -2452,13 +2424,12 @@
             <w:r>
               <w:rPr>
                 <w:rFonts w:ascii="Open Sans" w:hAnsi="Open Sans" w:cs="Open Sans"/>
-                <w:b/>
                 <w:bCs/>
                 <w:color w:val="FFFFFF"/>
                 <w:sz w:val="18"/>
                 <w:szCs w:val="18"/>
               </w:rPr>
-              <w:t xml:space="preserve">Check</w:t>
+              <w:t>Check</w:t>
             </w:r>
           </w:p>
         </w:tc>
@@ -2474,13 +2445,12 @@
             <w:r>
               <w:rPr>
                 <w:rFonts w:ascii="Open Sans" w:hAnsi="Open Sans" w:cs="Open Sans"/>
-                <w:b/>
                 <w:bCs/>
                 <w:color w:val="FFFFFF"/>
                 <w:sz w:val="18"/>
                 <w:szCs w:val="18"/>
               </w:rPr>
-              <w:t xml:space="preserve">Done by</w:t>
+              <w:t>Done by</w:t>
             </w:r>
           </w:p>
         </w:tc>
@@ -2505,7 +2475,7 @@
                 <w:sz w:val="18"/>
                 <w:szCs w:val="18"/>
               </w:rPr>
-              <w:t xml:space="preserve">Well-formed</w:t>
+              <w:t>Well-formed</w:t>
             </w:r>
           </w:p>
         </w:tc>
@@ -2525,7 +2495,7 @@
                 <w:sz w:val="18"/>
                 <w:szCs w:val="18"/>
               </w:rPr>
-              <w:t xml:space="preserve">Metric, threshold, period and source present</w:t>
+              <w:t>Metric, threshold, period and source present</w:t>
             </w:r>
           </w:p>
         </w:tc>
@@ -2545,7 +2515,7 @@
                 <w:sz w:val="18"/>
                 <w:szCs w:val="18"/>
               </w:rPr>
-              <w:t xml:space="preserve">Pydantic schema</w:t>
+              <w:t>Pydantic schema</w:t>
             </w:r>
           </w:p>
         </w:tc>
@@ -2571,7 +2541,7 @@
                 <w:sz w:val="18"/>
                 <w:szCs w:val="18"/>
               </w:rPr>
-              <w:t xml:space="preserve">No price claims</w:t>
+              <w:t>No price claims</w:t>
             </w:r>
           </w:p>
         </w:tc>
@@ -2592,7 +2562,7 @@
                 <w:sz w:val="18"/>
                 <w:szCs w:val="18"/>
               </w:rPr>
-              <w:t xml:space="preserve">No stock price, valuation multiple or price target</w:t>
+              <w:t>No stock price, valuation multiple or price target</w:t>
             </w:r>
           </w:p>
         </w:tc>
@@ -2613,7 +2583,7 @@
                 <w:sz w:val="18"/>
                 <w:szCs w:val="18"/>
               </w:rPr>
-              <w:t xml:space="preserve">Rule check</w:t>
+              <w:t>Rule check</w:t>
             </w:r>
           </w:p>
         </w:tc>
@@ -2638,7 +2608,7 @@
                 <w:sz w:val="18"/>
                 <w:szCs w:val="18"/>
               </w:rPr>
-              <w:t xml:space="preserve">Numbers kept</w:t>
+              <w:t>Numbers kept</w:t>
             </w:r>
           </w:p>
         </w:tc>
@@ -2658,7 +2628,7 @@
                 <w:sz w:val="18"/>
                 <w:szCs w:val="18"/>
               </w:rPr>
-              <w:t xml:space="preserve">The investor’s thresholds appear unchanged</w:t>
+              <w:t>The investor’s thresholds appear unchanged</w:t>
             </w:r>
           </w:p>
         </w:tc>
@@ -2678,7 +2648,7 @@
                 <w:sz w:val="18"/>
                 <w:szCs w:val="18"/>
               </w:rPr>
-              <w:t xml:space="preserve">Code</w:t>
+              <w:t>Code</w:t>
             </w:r>
           </w:p>
         </w:tc>
@@ -2704,7 +2674,7 @@
                 <w:sz w:val="18"/>
                 <w:szCs w:val="18"/>
               </w:rPr>
-              <w:t xml:space="preserve">Testable</w:t>
+              <w:t>Testable</w:t>
             </w:r>
           </w:p>
         </w:tc>
@@ -2735,7 +2705,7 @@
                 <w:sz w:val="16"/>
                 <w:szCs w:val="16"/>
               </w:rPr>
-              <w:t xml:space="preserve">search_filings</w:t>
+              <w:t>search_filings</w:t>
             </w:r>
             <w:r>
               <w:rPr>
@@ -2766,7 +2736,7 @@
                 <w:sz w:val="18"/>
                 <w:szCs w:val="18"/>
               </w:rPr>
-              <w:t xml:space="preserve">Tool probes</w:t>
+              <w:t>Tool probes</w:t>
             </w:r>
           </w:p>
         </w:tc>
@@ -2793,7 +2763,7 @@
           <w:sz w:val="21"/>
           <w:szCs w:val="21"/>
         </w:rPr>
-        <w:t xml:space="preserve">Probes return only “found” or “not found,” never values. Otherwise the search could pick claims whose result it already knows.</w:t>
+        <w:t>Probes return only “found” or “not found,” never values. Otherwise the search could pick claims whose result it already knows.</w:t>
       </w:r>
     </w:p>
     <w:tbl>
@@ -2838,13 +2808,12 @@
             <w:r>
               <w:rPr>
                 <w:rFonts w:ascii="Open Sans" w:hAnsi="Open Sans" w:cs="Open Sans"/>
-                <w:b/>
                 <w:bCs/>
                 <w:color w:val="FFFFFF"/>
                 <w:sz w:val="18"/>
                 <w:szCs w:val="18"/>
               </w:rPr>
-              <w:t xml:space="preserve">Criterion</w:t>
+              <w:t>Criterion</w:t>
             </w:r>
           </w:p>
         </w:tc>
@@ -2860,13 +2829,12 @@
             <w:r>
               <w:rPr>
                 <w:rFonts w:ascii="Open Sans" w:hAnsi="Open Sans" w:cs="Open Sans"/>
-                <w:b/>
                 <w:bCs/>
                 <w:color w:val="FFFFFF"/>
                 <w:sz w:val="18"/>
                 <w:szCs w:val="18"/>
               </w:rPr>
-              <w:t xml:space="preserve">Weight</w:t>
+              <w:t>Weight</w:t>
             </w:r>
           </w:p>
         </w:tc>
@@ -2882,13 +2850,12 @@
             <w:r>
               <w:rPr>
                 <w:rFonts w:ascii="Open Sans" w:hAnsi="Open Sans" w:cs="Open Sans"/>
-                <w:b/>
                 <w:bCs/>
                 <w:color w:val="FFFFFF"/>
                 <w:sz w:val="18"/>
                 <w:szCs w:val="18"/>
               </w:rPr>
-              <w:t xml:space="preserve">Scores 5 when</w:t>
+              <w:t>Scores 5 when</w:t>
             </w:r>
           </w:p>
         </w:tc>
@@ -2913,7 +2880,7 @@
                 <w:sz w:val="18"/>
                 <w:szCs w:val="18"/>
               </w:rPr>
-              <w:t xml:space="preserve">Faithful</w:t>
+              <w:t>Faithful</w:t>
             </w:r>
           </w:p>
         </w:tc>
@@ -2933,7 +2900,7 @@
                 <w:sz w:val="18"/>
                 <w:szCs w:val="18"/>
               </w:rPr>
-              <w:t xml:space="preserve">30%</w:t>
+              <w:t>30%</w:t>
             </w:r>
           </w:p>
         </w:tc>
@@ -2953,7 +2920,7 @@
                 <w:sz w:val="18"/>
                 <w:szCs w:val="18"/>
               </w:rPr>
-              <w:t xml:space="preserve">It tests the belief as stated, with the investor’s metric and time frame</w:t>
+              <w:t>It tests the belief as stated, with the investor’s metric and time frame</w:t>
             </w:r>
           </w:p>
         </w:tc>
@@ -2979,7 +2946,7 @@
                 <w:sz w:val="18"/>
                 <w:szCs w:val="18"/>
               </w:rPr>
-              <w:t xml:space="preserve">Covers the chain</w:t>
+              <w:t>Covers the chain</w:t>
             </w:r>
           </w:p>
         </w:tc>
@@ -3000,7 +2967,7 @@
                 <w:sz w:val="18"/>
                 <w:szCs w:val="18"/>
               </w:rPr>
-              <w:t xml:space="preserve">25%</w:t>
+              <w:t>25%</w:t>
             </w:r>
           </w:p>
         </w:tc>
@@ -3021,7 +2988,7 @@
                 <w:sz w:val="18"/>
                 <w:szCs w:val="18"/>
               </w:rPr>
-              <w:t xml:space="preserve">Every link from driver to outcome has a claim</w:t>
+              <w:t>Every link from driver to outcome has a claim</w:t>
             </w:r>
           </w:p>
         </w:tc>
@@ -3046,7 +3013,7 @@
                 <w:sz w:val="18"/>
                 <w:szCs w:val="18"/>
               </w:rPr>
-              <w:t xml:space="preserve">Could fail</w:t>
+              <w:t>Could fail</w:t>
             </w:r>
           </w:p>
         </w:tc>
@@ -3066,7 +3033,7 @@
                 <w:sz w:val="18"/>
                 <w:szCs w:val="18"/>
               </w:rPr>
-              <w:t xml:space="preserve">25%</w:t>
+              <w:t>25%</w:t>
             </w:r>
           </w:p>
         </w:tc>
@@ -3086,7 +3053,7 @@
                 <w:sz w:val="18"/>
                 <w:szCs w:val="18"/>
               </w:rPr>
-              <w:t xml:space="preserve">At least one claim could fail on the next filing (a check against bias)</w:t>
+              <w:t>At least one claim could fail on the next filing (a check against bias)</w:t>
             </w:r>
           </w:p>
         </w:tc>
@@ -3112,7 +3079,7 @@
                 <w:sz w:val="18"/>
                 <w:szCs w:val="18"/>
               </w:rPr>
-              <w:t xml:space="preserve">Distinct</w:t>
+              <w:t>Distinct</w:t>
             </w:r>
           </w:p>
         </w:tc>
@@ -3133,7 +3100,7 @@
                 <w:sz w:val="18"/>
                 <w:szCs w:val="18"/>
               </w:rPr>
-              <w:t xml:space="preserve">10%</w:t>
+              <w:t>10%</w:t>
             </w:r>
           </w:p>
         </w:tc>
@@ -3154,7 +3121,7 @@
                 <w:sz w:val="18"/>
                 <w:szCs w:val="18"/>
               </w:rPr>
-              <w:t xml:space="preserve">No two claims measure the same thing</w:t>
+              <w:t>No two claims measure the same thing</w:t>
             </w:r>
           </w:p>
         </w:tc>
@@ -3179,7 +3146,7 @@
                 <w:sz w:val="18"/>
                 <w:szCs w:val="18"/>
               </w:rPr>
-              <w:t xml:space="preserve">Clear</w:t>
+              <w:t>Clear</w:t>
             </w:r>
           </w:p>
         </w:tc>
@@ -3199,7 +3166,7 @@
                 <w:sz w:val="18"/>
                 <w:szCs w:val="18"/>
               </w:rPr>
-              <w:t xml:space="preserve">10%</w:t>
+              <w:t>10%</w:t>
             </w:r>
           </w:p>
         </w:tc>
@@ -3219,7 +3186,7 @@
                 <w:sz w:val="18"/>
                 <w:szCs w:val="18"/>
               </w:rPr>
-              <w:t xml:space="preserve">The investor can confirm it in one read</w:t>
+              <w:t>The investor can confirm it in one read</w:t>
             </w:r>
           </w:p>
         </w:tc>
@@ -3246,7 +3213,7 @@
           <w:sz w:val="21"/>
           <w:szCs w:val="21"/>
         </w:rPr>
-        <w:t xml:space="preserve">The critic scores each criterion from 1 to 5. Readings at depth 1 are scored on Faithful (60%) and Covers the chain (40%).</w:t>
+        <w:t>The critic scores each criterion from 1 to 5. Readings at depth 1 are scored on Faithful (60%) and Covers the chain (40%).</w:t>
       </w:r>
     </w:p>
     <w:p>
@@ -3265,7 +3232,7 @@
           <w:sz w:val="21"/>
           <w:szCs w:val="21"/>
         </w:rPr>
-        <w:t xml:space="preserve">It sees only the thesis and one candidate. It never sees the generator’s reasoning, the other candidates or the investor’s past edits.</w:t>
+        <w:t>It sees only the thesis and one candidate. It never sees the generator’s reasoning, the other candidates or the investor’s past edits.</w:t>
       </w:r>
     </w:p>
     <w:p>
@@ -3275,13 +3242,13 @@
       <w:r>
         <w:rPr>
           <w:rFonts w:ascii="Open Sans" w:hAnsi="Open Sans" w:cs="Open Sans"/>
-          <w:b/>
           <w:bCs/>
           <w:color w:val="000000"/>
           <w:sz w:val="21"/>
           <w:szCs w:val="21"/>
         </w:rPr>
-        <w:t xml:space="preserve">Pruning:</w:t>
+        <w:lastRenderedPageBreak/>
+        <w:t>Pruning:</w:t>
       </w:r>
     </w:p>
     <w:p>
@@ -3300,7 +3267,7 @@
           <w:sz w:val="21"/>
           <w:szCs w:val="21"/>
         </w:rPr>
-        <w:t xml:space="preserve">A claim that fails a gate is dropped.</w:t>
+        <w:t>A claim that fails a gate is dropped.</w:t>
       </w:r>
     </w:p>
     <w:p>
@@ -3319,7 +3286,7 @@
           <w:sz w:val="21"/>
           <w:szCs w:val="21"/>
         </w:rPr>
-        <w:t xml:space="preserve">Depth 1: a reading is pruned if it is price-based or scores Faithful &lt; 3. The top 2 survivors move on.</w:t>
+        <w:t>Depth 1: a reading is pruned if it is price-based or scores Faithful &lt; 3. The top 2 survivors move on.</w:t>
       </w:r>
     </w:p>
     <w:p>
@@ -3338,7 +3305,7 @@
           <w:sz w:val="21"/>
           <w:szCs w:val="21"/>
         </w:rPr>
-        <w:t xml:space="preserve">Depth 2: a claim set is pruned if fewer than 3 claims remain, its outcome claim is lost, it scores Faithful &lt; 3, or its total score is below 3.5.</w:t>
+        <w:t>Depth 2: a claim set is pruned if fewer than 3 claims remain, its outcome claim is lost, it scores Faithful &lt; 3, or its total score is below 3.5.</w:t>
       </w:r>
     </w:p>
     <w:p>
@@ -3357,7 +3324,7 @@
           <w:sz w:val="21"/>
           <w:szCs w:val="21"/>
         </w:rPr>
-        <w:t xml:space="preserve">If nothing survives, the analyst asks one clarifying question and reruns once. If nothing survives again, the result is “Untestable as stated.”</w:t>
+        <w:t>If nothing survives, the analyst asks one clarifying question and reruns once. If nothing survives again, the result is “Untestable as stated.”</w:t>
       </w:r>
     </w:p>
     <w:p>
@@ -3376,7 +3343,7 @@
           <w:sz w:val="21"/>
           <w:szCs w:val="21"/>
         </w:rPr>
-        <w:t xml:space="preserve">If the critic’s output is invalid twice, the system falls back to one linear decomposition through the same gates.</w:t>
+        <w:t>If the critic’s output is invalid twice, the system falls back to one linear decomposition through the same gates.</w:t>
       </w:r>
     </w:p>
     <w:p>
@@ -3386,13 +3353,12 @@
       <w:r>
         <w:rPr>
           <w:rFonts w:ascii="Open Sans" w:hAnsi="Open Sans" w:cs="Open Sans"/>
-          <w:b/>
           <w:bCs/>
           <w:color w:val="000000"/>
           <w:sz w:val="21"/>
           <w:szCs w:val="21"/>
         </w:rPr>
-        <w:t xml:space="preserve">Ties (scores within 0.25):</w:t>
+        <w:t>Ties (scores within 0.25):</w:t>
       </w:r>
     </w:p>
     <w:p>
@@ -3406,13 +3372,12 @@
       <w:r>
         <w:rPr>
           <w:rFonts w:ascii="Open Sans" w:hAnsi="Open Sans" w:cs="Open Sans"/>
-          <w:b/>
           <w:bCs/>
           <w:color w:val="000000"/>
           <w:sz w:val="21"/>
           <w:szCs w:val="21"/>
         </w:rPr>
-        <w:t xml:space="preserve">Different readings:</w:t>
+        <w:t>Different readings:</w:t>
       </w:r>
       <w:r>
         <w:rPr>
@@ -3436,13 +3401,12 @@
       <w:r>
         <w:rPr>
           <w:rFonts w:ascii="Open Sans" w:hAnsi="Open Sans" w:cs="Open Sans"/>
-          <w:b/>
           <w:bCs/>
           <w:color w:val="000000"/>
           <w:sz w:val="21"/>
           <w:szCs w:val="21"/>
         </w:rPr>
-        <w:t xml:space="preserve">Same reading:</w:t>
+        <w:t>Same reading:</w:t>
       </w:r>
       <w:r>
         <w:rPr>
@@ -3466,13 +3430,12 @@
       <w:r>
         <w:rPr>
           <w:rFonts w:ascii="Open Sans" w:hAnsi="Open Sans" w:cs="Open Sans"/>
-          <w:b/>
           <w:bCs/>
           <w:color w:val="A6192E"/>
           <w:sz w:val="25"/>
           <w:szCs w:val="25"/>
         </w:rPr>
-        <w:t xml:space="preserve">6. ToT in action</w:t>
+        <w:t>6. ToT in action</w:t>
       </w:r>
     </w:p>
     <w:p>
@@ -3489,7 +3452,7 @@
           <w:sz w:val="18"/>
           <w:szCs w:val="18"/>
         </w:rPr>
-        <w:t xml:space="preserve">(Illustrative; scores are hypothetical.)</w:t>
+        <w:t>(Illustrative; scores are hypothetical.)</w:t>
       </w:r>
     </w:p>
     <w:p>
@@ -3503,13 +3466,12 @@
       <w:r>
         <w:rPr>
           <w:rFonts w:ascii="Open Sans" w:hAnsi="Open Sans" w:cs="Open Sans"/>
-          <w:b/>
           <w:bCs/>
           <w:color w:val="000000"/>
           <w:sz w:val="21"/>
           <w:szCs w:val="21"/>
         </w:rPr>
-        <w:t xml:space="preserve">Linear chain:</w:t>
+        <w:t>Linear chain:</w:t>
       </w:r>
       <w:r>
         <w:rPr>
@@ -3533,13 +3495,12 @@
       <w:r>
         <w:rPr>
           <w:rFonts w:ascii="Open Sans" w:hAnsi="Open Sans" w:cs="Open Sans"/>
-          <w:b/>
           <w:bCs/>
           <w:color w:val="000000"/>
           <w:sz w:val="21"/>
           <w:szCs w:val="21"/>
         </w:rPr>
-        <w:t xml:space="preserve">ToT:</w:t>
+        <w:t>ToT:</w:t>
       </w:r>
     </w:p>
     <w:p>
@@ -3558,7 +3519,7 @@
           <w:sz w:val="21"/>
           <w:szCs w:val="21"/>
         </w:rPr>
-        <w:t xml:space="preserve">Keeps two readings: mix shift (4.6) and pricing power (4.4).</w:t>
+        <w:t>Keeps two readings: mix shift (4.6) and pricing power (4.4).</w:t>
       </w:r>
     </w:p>
     <w:p>
@@ -3577,7 +3538,7 @@
           <w:sz w:val="21"/>
           <w:szCs w:val="21"/>
         </w:rPr>
-        <w:t xml:space="preserve">Prunes “guidance only” (3.0).</w:t>
+        <w:t>Prunes “guidance only” (3.0).</w:t>
       </w:r>
     </w:p>
     <w:p>
@@ -3596,7 +3557,7 @@
           <w:sz w:val="21"/>
           <w:szCs w:val="21"/>
         </w:rPr>
-        <w:t xml:space="preserve">Drops an “AI accelerator revenue” claim, which isn’t reported, and a stock-price claim, which fails a gate.</w:t>
+        <w:t>Drops an “AI accelerator revenue” claim, which isn’t reported, and a stock-price claim, which fails a gate.</w:t>
       </w:r>
     </w:p>
     <w:p>
@@ -3610,13 +3571,12 @@
       <w:r>
         <w:rPr>
           <w:rFonts w:ascii="Open Sans" w:hAnsi="Open Sans" w:cs="Open Sans"/>
-          <w:b/>
           <w:bCs/>
           <w:color w:val="000000"/>
           <w:sz w:val="21"/>
           <w:szCs w:val="21"/>
         </w:rPr>
-        <w:t xml:space="preserve">Selected set (4.55):</w:t>
+        <w:t>Selected set (4.55):</w:t>
       </w:r>
       <w:r>
         <w:rPr>
@@ -3640,13 +3600,12 @@
       <w:r>
         <w:rPr>
           <w:rFonts w:ascii="Open Sans" w:hAnsi="Open Sans" w:cs="Open Sans"/>
-          <w:b/>
           <w:bCs/>
           <w:color w:val="A6192E"/>
           <w:sz w:val="25"/>
           <w:szCs w:val="25"/>
         </w:rPr>
-        <w:t xml:space="preserve">7. Mapping ToT roles to tools</w:t>
+        <w:t>7. Mapping ToT roles to tools</w:t>
       </w:r>
     </w:p>
     <w:tbl>
@@ -3692,13 +3651,12 @@
             <w:r>
               <w:rPr>
                 <w:rFonts w:ascii="Open Sans" w:hAnsi="Open Sans" w:cs="Open Sans"/>
-                <w:b/>
                 <w:bCs/>
                 <w:color w:val="FFFFFF"/>
                 <w:sz w:val="18"/>
                 <w:szCs w:val="18"/>
               </w:rPr>
-              <w:t xml:space="preserve">Role</w:t>
+              <w:t>Role</w:t>
             </w:r>
           </w:p>
         </w:tc>
@@ -3714,13 +3672,12 @@
             <w:r>
               <w:rPr>
                 <w:rFonts w:ascii="Open Sans" w:hAnsi="Open Sans" w:cs="Open Sans"/>
-                <w:b/>
                 <w:bCs/>
                 <w:color w:val="FFFFFF"/>
                 <w:sz w:val="18"/>
                 <w:szCs w:val="18"/>
               </w:rPr>
-              <w:t xml:space="preserve">LangChain / LangGraph</w:t>
+              <w:t>LangChain / LangGraph</w:t>
             </w:r>
           </w:p>
         </w:tc>
@@ -3736,13 +3693,12 @@
             <w:r>
               <w:rPr>
                 <w:rFonts w:ascii="Open Sans" w:hAnsi="Open Sans" w:cs="Open Sans"/>
-                <w:b/>
                 <w:bCs/>
                 <w:color w:val="FFFFFF"/>
                 <w:sz w:val="18"/>
                 <w:szCs w:val="18"/>
               </w:rPr>
-              <w:t xml:space="preserve">MCP</w:t>
+              <w:t>MCP</w:t>
             </w:r>
           </w:p>
         </w:tc>
@@ -3758,13 +3714,12 @@
             <w:r>
               <w:rPr>
                 <w:rFonts w:ascii="Open Sans" w:hAnsi="Open Sans" w:cs="Open Sans"/>
-                <w:b/>
                 <w:bCs/>
                 <w:color w:val="FFFFFF"/>
                 <w:sz w:val="18"/>
                 <w:szCs w:val="18"/>
               </w:rPr>
-              <w:t xml:space="preserve">CrewAI (evaluated)</w:t>
+              <w:t>CrewAI (evaluated)</w:t>
             </w:r>
           </w:p>
         </w:tc>
@@ -3789,7 +3744,7 @@
                 <w:sz w:val="18"/>
                 <w:szCs w:val="18"/>
               </w:rPr>
-              <w:t xml:space="preserve">Thought Generator</w:t>
+              <w:t>Thought Generator</w:t>
             </w:r>
           </w:p>
         </w:tc>
@@ -3804,13 +3759,12 @@
             <w:r>
               <w:rPr>
                 <w:rFonts w:ascii="Open Sans" w:hAnsi="Open Sans" w:cs="Open Sans"/>
-                <w:b/>
                 <w:bCs/>
                 <w:color w:val="000000"/>
                 <w:sz w:val="18"/>
                 <w:szCs w:val="18"/>
               </w:rPr>
-              <w:t xml:space="preserve">Used.</w:t>
+              <w:t>Used.</w:t>
             </w:r>
             <w:r>
               <w:rPr>
@@ -3835,13 +3789,12 @@
             <w:r>
               <w:rPr>
                 <w:rFonts w:ascii="Open Sans" w:hAnsi="Open Sans" w:cs="Open Sans"/>
-                <w:b/>
                 <w:bCs/>
                 <w:color w:val="000000"/>
                 <w:sz w:val="18"/>
                 <w:szCs w:val="18"/>
               </w:rPr>
-              <w:t xml:space="preserve">Used.</w:t>
+              <w:t>Used.</w:t>
             </w:r>
             <w:r>
               <w:rPr>
@@ -3881,17 +3834,17 @@
                 <w:sz w:val="16"/>
                 <w:szCs w:val="16"/>
               </w:rPr>
-              <w:t xml:space="preserve">Agent</w:t>
-            </w:r>
-            <w:r>
-              <w:rPr>
-                <w:rFonts w:ascii="Open Sans" w:hAnsi="Open Sans" w:cs="Open Sans"/>
-                <w:b w:val="0"/>
-                <w:color w:val="000000"/>
-                <w:sz w:val="18"/>
-                <w:szCs w:val="18"/>
-              </w:rPr>
-              <w:t xml:space="preserve">; not needed</w:t>
+              <w:t>Agent</w:t>
+            </w:r>
+            <w:r>
+              <w:rPr>
+                <w:rFonts w:ascii="Open Sans" w:hAnsi="Open Sans" w:cs="Open Sans"/>
+                <w:b w:val="0"/>
+                <w:color w:val="000000"/>
+                <w:sz w:val="18"/>
+                <w:szCs w:val="18"/>
+              </w:rPr>
+              <w:t>; not needed</w:t>
             </w:r>
           </w:p>
         </w:tc>
@@ -3917,7 +3870,7 @@
                 <w:sz w:val="18"/>
                 <w:szCs w:val="18"/>
               </w:rPr>
-              <w:t xml:space="preserve">Critic / evaluator</w:t>
+              <w:t>Critic / evaluator</w:t>
             </w:r>
           </w:p>
         </w:tc>
@@ -3933,13 +3886,12 @@
             <w:r>
               <w:rPr>
                 <w:rFonts w:ascii="Open Sans" w:hAnsi="Open Sans" w:cs="Open Sans"/>
-                <w:b/>
                 <w:bCs/>
                 <w:color w:val="000000"/>
                 <w:sz w:val="18"/>
                 <w:szCs w:val="18"/>
               </w:rPr>
-              <w:t xml:space="preserve">Used.</w:t>
+              <w:t>Used.</w:t>
             </w:r>
             <w:r>
               <w:rPr>
@@ -3965,13 +3917,12 @@
             <w:r>
               <w:rPr>
                 <w:rFonts w:ascii="Open Sans" w:hAnsi="Open Sans" w:cs="Open Sans"/>
-                <w:b/>
                 <w:bCs/>
                 <w:color w:val="000000"/>
                 <w:sz w:val="18"/>
                 <w:szCs w:val="18"/>
               </w:rPr>
-              <w:t xml:space="preserve">Used.</w:t>
+              <w:t>Used.</w:t>
             </w:r>
             <w:r>
               <w:rPr>
@@ -3991,7 +3942,7 @@
                 <w:sz w:val="16"/>
                 <w:szCs w:val="16"/>
               </w:rPr>
-              <w:t xml:space="preserve">search_filings</w:t>
+              <w:t>search_filings</w:t>
             </w:r>
             <w:r>
               <w:rPr>
@@ -4032,17 +3983,17 @@
                 <w:sz w:val="16"/>
                 <w:szCs w:val="16"/>
               </w:rPr>
-              <w:t xml:space="preserve">Agent</w:t>
-            </w:r>
-            <w:r>
-              <w:rPr>
-                <w:rFonts w:ascii="Open Sans" w:hAnsi="Open Sans" w:cs="Open Sans"/>
-                <w:b w:val="0"/>
-                <w:color w:val="000000"/>
-                <w:sz w:val="18"/>
-                <w:szCs w:val="18"/>
-              </w:rPr>
-              <w:t xml:space="preserve">; shared crew memory would break the critic’s isolation</w:t>
+              <w:t>Agent</w:t>
+            </w:r>
+            <w:r>
+              <w:rPr>
+                <w:rFonts w:ascii="Open Sans" w:hAnsi="Open Sans" w:cs="Open Sans"/>
+                <w:b w:val="0"/>
+                <w:color w:val="000000"/>
+                <w:sz w:val="18"/>
+                <w:szCs w:val="18"/>
+              </w:rPr>
+              <w:t>; shared crew memory would break the critic’s isolation</w:t>
             </w:r>
           </w:p>
         </w:tc>
@@ -4067,7 +4018,8 @@
                 <w:sz w:val="18"/>
                 <w:szCs w:val="18"/>
               </w:rPr>
-              <w:t xml:space="preserve">Decision maker</w:t>
+              <w:lastRenderedPageBreak/>
+              <w:t>Decision maker</w:t>
             </w:r>
           </w:p>
         </w:tc>
@@ -4082,13 +4034,12 @@
             <w:r>
               <w:rPr>
                 <w:rFonts w:ascii="Open Sans" w:hAnsi="Open Sans" w:cs="Open Sans"/>
-                <w:b/>
                 <w:bCs/>
                 <w:color w:val="000000"/>
                 <w:sz w:val="18"/>
                 <w:szCs w:val="18"/>
               </w:rPr>
-              <w:t xml:space="preserve">Used.</w:t>
+              <w:t>Used.</w:t>
             </w:r>
             <w:r>
               <w:rPr>
@@ -4118,7 +4069,7 @@
                 <w:sz w:val="18"/>
                 <w:szCs w:val="18"/>
               </w:rPr>
-              <w:t xml:space="preserve">Not used</w:t>
+              <w:t>Not used</w:t>
             </w:r>
           </w:p>
         </w:tc>
@@ -4138,7 +4089,7 @@
                 <w:sz w:val="18"/>
                 <w:szCs w:val="18"/>
               </w:rPr>
-              <w:t xml:space="preserve">Not suitable: a manager LLM would choose the next step</w:t>
+              <w:t>Not suitable: a manager LLM would choose the next step</w:t>
             </w:r>
           </w:p>
         </w:tc>
@@ -4164,7 +4115,7 @@
                 <w:sz w:val="18"/>
                 <w:szCs w:val="18"/>
               </w:rPr>
-              <w:t xml:space="preserve">State manager</w:t>
+              <w:t>State manager</w:t>
             </w:r>
           </w:p>
         </w:tc>
@@ -4180,13 +4131,12 @@
             <w:r>
               <w:rPr>
                 <w:rFonts w:ascii="Open Sans" w:hAnsi="Open Sans" w:cs="Open Sans"/>
-                <w:b/>
                 <w:bCs/>
                 <w:color w:val="000000"/>
                 <w:sz w:val="18"/>
                 <w:szCs w:val="18"/>
               </w:rPr>
-              <w:t xml:space="preserve">Used.</w:t>
+              <w:t>Used.</w:t>
             </w:r>
             <w:r>
               <w:rPr>
@@ -4212,13 +4162,12 @@
             <w:r>
               <w:rPr>
                 <w:rFonts w:ascii="Open Sans" w:hAnsi="Open Sans" w:cs="Open Sans"/>
-                <w:b/>
                 <w:bCs/>
                 <w:color w:val="000000"/>
                 <w:sz w:val="18"/>
                 <w:szCs w:val="18"/>
               </w:rPr>
-              <w:t xml:space="preserve">Used.</w:t>
+              <w:t>Used.</w:t>
             </w:r>
             <w:r>
               <w:rPr>
@@ -4249,7 +4198,7 @@
                 <w:sz w:val="18"/>
                 <w:szCs w:val="18"/>
               </w:rPr>
-              <w:t xml:space="preserve">Not used: it would duplicate state</w:t>
+              <w:t>Not used: it would duplicate state</w:t>
             </w:r>
           </w:p>
         </w:tc>
@@ -4267,13 +4216,12 @@
       <w:r>
         <w:rPr>
           <w:rFonts w:ascii="Open Sans" w:hAnsi="Open Sans" w:cs="Open Sans"/>
-          <w:b/>
           <w:bCs/>
           <w:color w:val="000000"/>
           <w:sz w:val="21"/>
           <w:szCs w:val="21"/>
         </w:rPr>
-        <w:t xml:space="preserve">Why not CrewAI:</w:t>
+        <w:t>Why not CrewAI:</w:t>
       </w:r>
     </w:p>
     <w:p>
@@ -4292,7 +4240,7 @@
           <w:sz w:val="21"/>
           <w:szCs w:val="21"/>
         </w:rPr>
-        <w:t xml:space="preserve">Its strengths are delegation between agents and a manager LLM that routes work. Thesis Check’s fixed workflow rules out both.</w:t>
+        <w:t>Its strengths are delegation between agents and a manager LLM that routes work. Thesis Check’s fixed workflow rules out both.</w:t>
       </w:r>
     </w:p>
     <w:p>
@@ -4311,7 +4259,7 @@
           <w:sz w:val="21"/>
           <w:szCs w:val="21"/>
         </w:rPr>
-        <w:t xml:space="preserve">Role separation already comes from LangGraph nodes with separate prompts and scoped state.</w:t>
+        <w:t>Role separation already comes from LangGraph nodes with separate prompts and scoped state.</w:t>
       </w:r>
     </w:p>
     <w:p>
@@ -4330,7 +4278,39 @@
           <w:sz w:val="21"/>
           <w:szCs w:val="21"/>
         </w:rPr>
-        <w:t xml:space="preserve">Revisit CrewAI if defining all eight agents in LangGraph proves clumsy.</w:t>
+        <w:t>We shall r</w:t>
+      </w:r>
+      <w:r>
+        <w:rPr>
+          <w:rFonts w:ascii="Open Sans" w:hAnsi="Open Sans" w:cs="Open Sans"/>
+          <w:b w:val="0"/>
+          <w:color w:val="000000"/>
+          <w:sz w:val="21"/>
+          <w:szCs w:val="21"/>
+        </w:rPr>
+        <w:t xml:space="preserve">evisit </w:t>
+      </w:r>
+      <w:proofErr w:type="spellStart"/>
+      <w:r>
+        <w:rPr>
+          <w:rFonts w:ascii="Open Sans" w:hAnsi="Open Sans" w:cs="Open Sans"/>
+          <w:b w:val="0"/>
+          <w:color w:val="000000"/>
+          <w:sz w:val="21"/>
+          <w:szCs w:val="21"/>
+        </w:rPr>
+        <w:t>CrewAI</w:t>
+      </w:r>
+      <w:proofErr w:type="spellEnd"/>
+      <w:r>
+        <w:rPr>
+          <w:rFonts w:ascii="Open Sans" w:hAnsi="Open Sans" w:cs="Open Sans"/>
+          <w:b w:val="0"/>
+          <w:color w:val="000000"/>
+          <w:sz w:val="21"/>
+          <w:szCs w:val="21"/>
+        </w:rPr>
+        <w:t xml:space="preserve"> if defining all eight agents in LangGraph proves clumsy.</w:t>
       </w:r>
     </w:p>
     <w:p>
@@ -4344,13 +4324,12 @@
       <w:r>
         <w:rPr>
           <w:rFonts w:ascii="Open Sans" w:hAnsi="Open Sans" w:cs="Open Sans"/>
-          <w:b/>
           <w:bCs/>
           <w:color w:val="A6192E"/>
           <w:sz w:val="25"/>
           <w:szCs w:val="25"/>
         </w:rPr>
-        <w:t xml:space="preserve">8. Risk and mitigation</w:t>
+        <w:t>8. Risk and mitigation</w:t>
       </w:r>
     </w:p>
     <w:p>
@@ -4360,13 +4339,12 @@
       <w:r>
         <w:rPr>
           <w:rFonts w:ascii="Open Sans" w:hAnsi="Open Sans" w:cs="Open Sans"/>
-          <w:b/>
           <w:bCs/>
           <w:color w:val="000000"/>
           <w:sz w:val="21"/>
           <w:szCs w:val="21"/>
         </w:rPr>
-        <w:t xml:space="preserve">Risk: weak evaluation signals prune the best branch too early.</w:t>
+        <w:t>Risk: weak evaluation signals prune the best branch too early.</w:t>
       </w:r>
     </w:p>
     <w:p>
@@ -4385,7 +4363,7 @@
           <w:sz w:val="21"/>
           <w:szCs w:val="21"/>
         </w:rPr>
-        <w:t xml:space="preserve">Beam cuts are final.</w:t>
+        <w:t>Beam cuts are final.</w:t>
       </w:r>
     </w:p>
     <w:p>
@@ -4404,7 +4382,7 @@
           <w:sz w:val="21"/>
           <w:szCs w:val="21"/>
         </w:rPr>
-        <w:t xml:space="preserve">The critic infers what the investor meant from one sentence, and may prefer the most common or most fluent reading.</w:t>
+        <w:t>The critic infers what the investor meant from one sentence, and may prefer the most common or most fluent reading.</w:t>
       </w:r>
     </w:p>
     <w:p>
@@ -4414,13 +4392,12 @@
       <w:r>
         <w:rPr>
           <w:rFonts w:ascii="Open Sans" w:hAnsi="Open Sans" w:cs="Open Sans"/>
-          <w:b/>
           <w:bCs/>
           <w:color w:val="000000"/>
           <w:sz w:val="21"/>
           <w:szCs w:val="21"/>
         </w:rPr>
-        <w:t xml:space="preserve">Mitigation: the critic ranks but rarely cuts, and is calibrated first.</w:t>
+        <w:t>Mitigation: the critic ranks but rarely cuts, and is calibrated first.</w:t>
       </w:r>
     </w:p>
     <w:p>
@@ -4439,7 +4416,7 @@
           <w:sz w:val="21"/>
           <w:szCs w:val="21"/>
         </w:rPr>
-        <w:t xml:space="preserve">Only objective checks cut outright: the gates and clear misreadings (Faithful &lt; 3).</w:t>
+        <w:t>Only objective checks cut outright: the gates and clear misreadings (Faithful &lt; 3).</w:t>
       </w:r>
     </w:p>
     <w:p>
@@ -4458,7 +4435,7 @@
           <w:sz w:val="21"/>
           <w:szCs w:val="21"/>
         </w:rPr>
-        <w:t xml:space="preserve">A beam width of 2 keeps a backup reading, and near-ties go to the investor.</w:t>
+        <w:t>A beam width of 2 keeps a backup reading, and near-ties go to the investor.</w:t>
       </w:r>
     </w:p>
     <w:p>
@@ -4477,7 +4454,7 @@
           <w:sz w:val="21"/>
           <w:szCs w:val="21"/>
         </w:rPr>
-        <w:t xml:space="preserve">Before go-live, ToT is calibrated on about 20 golden theses: the reference reading must survive depth 1 at least 90% of the time.</w:t>
+        <w:t>Before go-live, ToT is calibrated on about 20 golden theses: the reference reading must survive depth 1 at least 90% of the time.</w:t>
       </w:r>
     </w:p>
     <w:p>
@@ -4496,7 +4473,7 @@
           <w:sz w:val="21"/>
           <w:szCs w:val="21"/>
         </w:rPr>
-        <w:t xml:space="preserve">Every pruned branch is logged with its score and reason.</w:t>
+        <w:t>Every pruned branch is logged with its score and reason.</w:t>
       </w:r>
     </w:p>
     <w:p>
@@ -4510,13 +4487,12 @@
       <w:r>
         <w:rPr>
           <w:rFonts w:ascii="Open Sans" w:hAnsi="Open Sans" w:cs="Open Sans"/>
-          <w:b/>
           <w:bCs/>
           <w:color w:val="A6192E"/>
           <w:sz w:val="25"/>
           <w:szCs w:val="25"/>
         </w:rPr>
-        <w:t xml:space="preserve">9. Project repository</w:t>
+        <w:t>9. Project repository</w:t>
       </w:r>
     </w:p>
     <w:p>
@@ -4533,7 +4509,7 @@
         </w:rPr>
         <w:t xml:space="preserve">Repository: </w:t>
       </w:r>
-      <w:hyperlink r:id="rId201" w:history="1">
+      <w:hyperlink r:id="rId13" w:history="1">
         <w:r>
           <w:rPr>
             <w:rStyle w:val="Hyperlink"/>
@@ -4542,7 +4518,7 @@
             <w:sz w:val="21"/>
             <w:szCs w:val="21"/>
           </w:rPr>
-          <w:t xml:space="preserve">https://github.com/mosachde/agentic-ai-real-world-capstone-work</w:t>
+          <w:t>https://github.com/mosachde/agentic-ai-real-world-capstone-work</w:t>
         </w:r>
       </w:hyperlink>
     </w:p>
@@ -4560,7 +4536,7 @@
         </w:rPr>
         <w:t xml:space="preserve">This checkpoint: </w:t>
       </w:r>
-      <w:hyperlink r:id="rId202" w:history="1">
+      <w:hyperlink r:id="rId14" w:history="1">
         <w:r>
           <w:rPr>
             <w:rStyle w:val="Hyperlink"/>
@@ -4569,7 +4545,7 @@
             <w:sz w:val="21"/>
             <w:szCs w:val="21"/>
           </w:rPr>
-          <w:t xml:space="preserve">https://github.com/mosachde/agentic-ai-real-world-capstone-work/tree/checkpoint-4.1/docs</w:t>
+          <w:t>https://github.com/mosachde/agentic-ai-real-world-capstone-work/tree/checkpoint-4.1/docs</w:t>
         </w:r>
       </w:hyperlink>
     </w:p>
@@ -6129,7 +6105,7 @@
         <w:sz w:val="20"/>
       </w:rPr>
     </w:lvl>
-    <w:lvl w:ilvl="1" w:tentative="1">
+    <w:lvl w:ilvl="1">
       <w:start w:val="1"/>
       <w:numFmt w:val="bullet"/>
       <w:lvlText w:val="o"/>
@@ -8368,19 +8344,12 @@
 </file>
 
 <file path=customXml/item2.xml><?xml version="1.0" encoding="utf-8"?>
-<b:Sources xmlns:b="http://schemas.openxmlformats.org/officeDocument/2006/bibliography" xmlns="http://schemas.openxmlformats.org/officeDocument/2006/bibliography" SelectedStyle="\APASixthEditionOfficeOnline.xsl" StyleName="APA" Version="6"/>
+<go:gDocsCustomXmlDataStorage xmlns:go="http://customooxmlschemas.google.com/" xmlns:r="http://schemas.openxmlformats.org/officeDocument/2006/relationships">
+  <go:docsCustomData xmlns:go="http://customooxmlschemas.google.com/" roundtripDataSignature="AMtx7mipwmvtScRWrTBXm/U1U4IL8/yT+Q==">AMUW2mUo3hs247llBQCCeIDyw/o6c4OsjQII5teSoi43v/barLRmXDTC1CnGRzyBBJBKXLTUgrf3Q76HNtJ+zdOE8iULy8k79jUPrIuPxOm7e3PYoIxsqb0=</go:docsCustomData>
+</go:gDocsCustomXmlDataStorage>
 </file>
 
 <file path=customXml/item3.xml><?xml version="1.0" encoding="utf-8"?>
-<?mso-contentType ?>
-<FormTemplates xmlns="http://schemas.microsoft.com/sharepoint/v3/contenttype/forms">
-  <Display>DocumentLibraryForm</Display>
-  <Edit>DocumentLibraryForm</Edit>
-  <New>DocumentLibraryForm</New>
-</FormTemplates>
-</file>
-
-<file path=customXml/item4.xml><?xml version="1.0" encoding="utf-8"?>
 <p:properties xmlns:p="http://schemas.microsoft.com/office/2006/metadata/properties" xmlns:xsi="http://www.w3.org/2001/XMLSchema-instance" xmlns:pc="http://schemas.microsoft.com/office/infopath/2007/PartnerControls">
   <documentManagement>
     <lcf76f155ced4ddcb4097134ff3c332f xmlns="b950caa2-3060-400e-ac69-190ee22b5a3c">
@@ -8391,10 +8360,17 @@
 </p:properties>
 </file>
 
+<file path=customXml/item4.xml><?xml version="1.0" encoding="utf-8"?>
+<?mso-contentType ?>
+<FormTemplates xmlns="http://schemas.microsoft.com/sharepoint/v3/contenttype/forms">
+  <Display>DocumentLibraryForm</Display>
+  <Edit>DocumentLibraryForm</Edit>
+  <New>DocumentLibraryForm</New>
+</FormTemplates>
+</file>
+
 <file path=customXml/item5.xml><?xml version="1.0" encoding="utf-8"?>
-<go:gDocsCustomXmlDataStorage xmlns:go="http://customooxmlschemas.google.com/" xmlns:r="http://schemas.openxmlformats.org/officeDocument/2006/relationships">
-  <go:docsCustomData xmlns:go="http://customooxmlschemas.google.com/" roundtripDataSignature="AMtx7mipwmvtScRWrTBXm/U1U4IL8/yT+Q==">AMUW2mUo3hs247llBQCCeIDyw/o6c4OsjQII5teSoi43v/barLRmXDTC1CnGRzyBBJBKXLTUgrf3Q76HNtJ+zdOE8iULy8k79jUPrIuPxOm7e3PYoIxsqb0=</go:docsCustomData>
-</go:gDocsCustomXmlDataStorage>
+<b:Sources xmlns:b="http://schemas.openxmlformats.org/officeDocument/2006/bibliography" xmlns="http://schemas.openxmlformats.org/officeDocument/2006/bibliography" SelectedStyle="\APASixthEditionOfficeOnline.xsl" StyleName="APA" Version="6"/>
 </file>
 
 <file path=customXml/itemProps1.xml><?xml version="1.0" encoding="utf-8"?>
@@ -8417,22 +8393,15 @@
 </file>
 
 <file path=customXml/itemProps2.xml><?xml version="1.0" encoding="utf-8"?>
-<ds:datastoreItem xmlns:ds="http://schemas.openxmlformats.org/officeDocument/2006/customXml" ds:itemID="{077DB219-E873-4711-93A1-466AFC3AFFCD}">
+<ds:datastoreItem xmlns:ds="http://schemas.openxmlformats.org/officeDocument/2006/customXml" ds:itemID="{11111111-1234-1234-1234-123412341234}">
   <ds:schemaRefs>
-    <ds:schemaRef ds:uri="http://schemas.openxmlformats.org/officeDocument/2006/bibliography"/>
+    <ds:schemaRef ds:uri="http://customooxmlschemas.google.com/"/>
+    <ds:schemaRef ds:uri="http://schemas.openxmlformats.org/officeDocument/2006/relationships"/>
   </ds:schemaRefs>
 </ds:datastoreItem>
 </file>
 
 <file path=customXml/itemProps3.xml><?xml version="1.0" encoding="utf-8"?>
-<ds:datastoreItem xmlns:ds="http://schemas.openxmlformats.org/officeDocument/2006/customXml" ds:itemID="{D2C18057-4B07-48E5-9C44-6590717A6C35}">
-  <ds:schemaRefs>
-    <ds:schemaRef ds:uri="http://schemas.microsoft.com/sharepoint/v3/contenttype/forms"/>
-  </ds:schemaRefs>
-</ds:datastoreItem>
-</file>
-
-<file path=customXml/itemProps4.xml><?xml version="1.0" encoding="utf-8"?>
 <ds:datastoreItem xmlns:ds="http://schemas.openxmlformats.org/officeDocument/2006/customXml" ds:itemID="{60719B45-0898-4DEB-BD0F-162ECB033CEC}">
   <ds:schemaRefs>
     <ds:schemaRef ds:uri="http://schemas.microsoft.com/office/2006/metadata/properties"/>
@@ -8443,11 +8412,18 @@
 </ds:datastoreItem>
 </file>
 
+<file path=customXml/itemProps4.xml><?xml version="1.0" encoding="utf-8"?>
+<ds:datastoreItem xmlns:ds="http://schemas.openxmlformats.org/officeDocument/2006/customXml" ds:itemID="{D2C18057-4B07-48E5-9C44-6590717A6C35}">
+  <ds:schemaRefs>
+    <ds:schemaRef ds:uri="http://schemas.microsoft.com/sharepoint/v3/contenttype/forms"/>
+  </ds:schemaRefs>
+</ds:datastoreItem>
+</file>
+
 <file path=customXml/itemProps5.xml><?xml version="1.0" encoding="utf-8"?>
-<ds:datastoreItem xmlns:ds="http://schemas.openxmlformats.org/officeDocument/2006/customXml" ds:itemID="{11111111-1234-1234-1234-123412341234}">
+<ds:datastoreItem xmlns:ds="http://schemas.openxmlformats.org/officeDocument/2006/customXml" ds:itemID="{077DB219-E873-4711-93A1-466AFC3AFFCD}">
   <ds:schemaRefs>
-    <ds:schemaRef ds:uri="http://customooxmlschemas.google.com/"/>
-    <ds:schemaRef ds:uri="http://schemas.openxmlformats.org/officeDocument/2006/relationships"/>
+    <ds:schemaRef ds:uri="http://schemas.openxmlformats.org/officeDocument/2006/bibliography"/>
   </ds:schemaRefs>
 </ds:datastoreItem>
 </file>
</xml_diff>